<commit_message>
Update project files and add .gitignore
</commit_message>
<xml_diff>
--- a/Electrotechnics and Electrical Machines/Ohm's Law_AntohiAndiIonel_2111C L1.docx
+++ b/Electrotechnics and Electrical Machines/Ohm's Law_AntohiAndiIonel_2111C L1.docx
@@ -15,6 +15,12 @@
           <w:color w:val="FFFFFF" w:themeColor="background1"/>
           <w:sz w:val="36"/>
           <w:szCs w:val="36"/>
+          <w14:glow w14:rad="228600">
+            <w14:schemeClr w14:val="accent3">
+              <w14:alpha w14:val="60000"/>
+              <w14:satMod w14:val="175000"/>
+            </w14:schemeClr>
+          </w14:glow>
         </w:rPr>
       </w:pPr>
       <w:r>
@@ -23,8 +29,14 @@
           <w:color w:val="FFFFFF" w:themeColor="background1"/>
           <w:sz w:val="36"/>
           <w:szCs w:val="36"/>
+          <w14:glow w14:rad="228600">
+            <w14:schemeClr w14:val="accent3">
+              <w14:alpha w14:val="60000"/>
+              <w14:satMod w14:val="175000"/>
+            </w14:schemeClr>
+          </w14:glow>
         </w:rPr>
-        <w:t>Laboratory 1 of E</w:t>
+        <w:t>Laboratory 1 of Electrotechnics and Electric</w:t>
       </w:r>
       <w:r>
         <w:rPr>
@@ -32,33 +44,12 @@
           <w:color w:val="FFFFFF" w:themeColor="background1"/>
           <w:sz w:val="36"/>
           <w:szCs w:val="36"/>
-        </w:rPr>
-        <w:t xml:space="preserve">lectrotechnics and </w:t>
-      </w:r>
-      <w:r>
-        <w:rPr>
-          <w:rFonts w:ascii="Times New Roman" w:hAnsi="Times New Roman" w:cs="Times New Roman"/>
-          <w:color w:val="FFFFFF" w:themeColor="background1"/>
-          <w:sz w:val="36"/>
-          <w:szCs w:val="36"/>
-        </w:rPr>
-        <w:t>E</w:t>
-      </w:r>
-      <w:r>
-        <w:rPr>
-          <w:rFonts w:ascii="Times New Roman" w:hAnsi="Times New Roman" w:cs="Times New Roman"/>
-          <w:color w:val="FFFFFF" w:themeColor="background1"/>
-          <w:sz w:val="36"/>
-          <w:szCs w:val="36"/>
-        </w:rPr>
-        <w:t>lectric</w:t>
-      </w:r>
-      <w:r>
-        <w:rPr>
-          <w:rFonts w:ascii="Times New Roman" w:hAnsi="Times New Roman" w:cs="Times New Roman"/>
-          <w:color w:val="FFFFFF" w:themeColor="background1"/>
-          <w:sz w:val="36"/>
-          <w:szCs w:val="36"/>
+          <w14:glow w14:rad="228600">
+            <w14:schemeClr w14:val="accent3">
+              <w14:alpha w14:val="60000"/>
+              <w14:satMod w14:val="175000"/>
+            </w14:schemeClr>
+          </w14:glow>
         </w:rPr>
         <w:t>al</w:t>
       </w:r>
@@ -68,35 +59,14 @@
           <w:color w:val="FFFFFF" w:themeColor="background1"/>
           <w:sz w:val="36"/>
           <w:szCs w:val="36"/>
+          <w14:glow w14:rad="228600">
+            <w14:schemeClr w14:val="accent3">
+              <w14:alpha w14:val="60000"/>
+              <w14:satMod w14:val="175000"/>
+            </w14:schemeClr>
+          </w14:glow>
         </w:rPr>
-        <w:t xml:space="preserve"> </w:t>
-      </w:r>
-      <w:r>
-        <w:rPr>
-          <w:rFonts w:ascii="Times New Roman" w:hAnsi="Times New Roman" w:cs="Times New Roman"/>
-          <w:color w:val="FFFFFF" w:themeColor="background1"/>
-          <w:sz w:val="36"/>
-          <w:szCs w:val="36"/>
-        </w:rPr>
-        <w:t>M</w:t>
-      </w:r>
-      <w:r>
-        <w:rPr>
-          <w:rFonts w:ascii="Times New Roman" w:hAnsi="Times New Roman" w:cs="Times New Roman"/>
-          <w:color w:val="FFFFFF" w:themeColor="background1"/>
-          <w:sz w:val="36"/>
-          <w:szCs w:val="36"/>
-        </w:rPr>
-        <w:t>achines</w:t>
-      </w:r>
-      <w:r>
-        <w:rPr>
-          <w:rFonts w:ascii="Times New Roman" w:hAnsi="Times New Roman" w:cs="Times New Roman"/>
-          <w:color w:val="FFFFFF" w:themeColor="background1"/>
-          <w:sz w:val="36"/>
-          <w:szCs w:val="36"/>
-        </w:rPr>
-        <w:t xml:space="preserve"> </w:t>
+        <w:t xml:space="preserve"> Machines </w:t>
       </w:r>
     </w:p>
     <w:p>
@@ -108,6 +78,12 @@
           <w:color w:val="FFFFFF" w:themeColor="background1"/>
           <w:sz w:val="36"/>
           <w:szCs w:val="36"/>
+          <w14:glow w14:rad="228600">
+            <w14:schemeClr w14:val="accent3">
+              <w14:alpha w14:val="60000"/>
+              <w14:satMod w14:val="175000"/>
+            </w14:schemeClr>
+          </w14:glow>
         </w:rPr>
       </w:pPr>
       <w:r>
@@ -116,6 +92,12 @@
           <w:color w:val="FFFFFF" w:themeColor="background1"/>
           <w:sz w:val="36"/>
           <w:szCs w:val="36"/>
+          <w14:glow w14:rad="228600">
+            <w14:schemeClr w14:val="accent3">
+              <w14:alpha w14:val="60000"/>
+              <w14:satMod w14:val="175000"/>
+            </w14:schemeClr>
+          </w14:glow>
         </w:rPr>
         <w:t xml:space="preserve">Antohi Andi Ionel, </w:t>
       </w:r>
@@ -125,6 +107,12 @@
           <w:color w:val="FFFFFF" w:themeColor="background1"/>
           <w:sz w:val="36"/>
           <w:szCs w:val="36"/>
+          <w14:glow w14:rad="228600">
+            <w14:schemeClr w14:val="accent3">
+              <w14:alpha w14:val="60000"/>
+              <w14:satMod w14:val="175000"/>
+            </w14:schemeClr>
+          </w14:glow>
         </w:rPr>
         <w:t>Navigation</w:t>
       </w:r>
@@ -134,6 +122,12 @@
           <w:color w:val="FFFFFF" w:themeColor="background1"/>
           <w:sz w:val="36"/>
           <w:szCs w:val="36"/>
+          <w14:glow w14:rad="228600">
+            <w14:schemeClr w14:val="accent3">
+              <w14:alpha w14:val="60000"/>
+              <w14:satMod w14:val="175000"/>
+            </w14:schemeClr>
+          </w14:glow>
         </w:rPr>
         <w:t xml:space="preserve">, </w:t>
       </w:r>
@@ -143,6 +137,12 @@
           <w:color w:val="FFFFFF" w:themeColor="background1"/>
           <w:sz w:val="36"/>
           <w:szCs w:val="36"/>
+          <w14:glow w14:rad="228600">
+            <w14:schemeClr w14:val="accent3">
+              <w14:alpha w14:val="60000"/>
+              <w14:satMod w14:val="175000"/>
+            </w14:schemeClr>
+          </w14:glow>
         </w:rPr>
         <w:t>group</w:t>
       </w:r>
@@ -152,6 +152,12 @@
           <w:color w:val="FFFFFF" w:themeColor="background1"/>
           <w:sz w:val="36"/>
           <w:szCs w:val="36"/>
+          <w14:glow w14:rad="228600">
+            <w14:schemeClr w14:val="accent3">
+              <w14:alpha w14:val="60000"/>
+              <w14:satMod w14:val="175000"/>
+            </w14:schemeClr>
+          </w14:glow>
         </w:rPr>
         <w:t xml:space="preserve"> </w:t>
       </w:r>
@@ -161,6 +167,12 @@
           <w:color w:val="FFFFFF" w:themeColor="background1"/>
           <w:sz w:val="36"/>
           <w:szCs w:val="36"/>
+          <w14:glow w14:rad="228600">
+            <w14:schemeClr w14:val="accent3">
+              <w14:alpha w14:val="60000"/>
+              <w14:satMod w14:val="175000"/>
+            </w14:schemeClr>
+          </w14:glow>
         </w:rPr>
         <w:t>211</w:t>
       </w:r>
@@ -170,6 +182,12 @@
           <w:color w:val="FFFFFF" w:themeColor="background1"/>
           <w:sz w:val="36"/>
           <w:szCs w:val="36"/>
+          <w14:glow w14:rad="228600">
+            <w14:schemeClr w14:val="accent3">
+              <w14:alpha w14:val="60000"/>
+              <w14:satMod w14:val="175000"/>
+            </w14:schemeClr>
+          </w14:glow>
         </w:rPr>
         <w:t>C</w:t>
       </w:r>

</xml_diff>